<commit_message>
Document therapy analyses 08-11 in README and Word guide, drop PCA
</commit_message>
<xml_diff>
--- a/outputs/腫瘤分枝模型圖解.docx
+++ b/outputs/腫瘤分枝模型圖解.docx
@@ -20,7 +20,7 @@
           <w:color w:val="56666F"/>
           <w:sz w:val="24"/>
         </w:rPr>
-        <w:t>BME 6120 作業一的 11 張主圖、備用圖與附錄逐張說明：每張圖為什麼做、怎麼讀、看到什麼、有什麼限制。這一版依合併建議把 17 張整理成 13 張，並把 PCA 改成回答「哪個因子決定腫瘤往哪走」。</w:t>
+        <w:t>BME 6120 作業一的主圖、備用圖與附錄逐張說明：每張圖為什麼做、怎麼讀、看到什麼、有什麼限制。這一版依合併建議把 17 張整理成 13 張，刪掉與模擬關係較遠的 PCA，並新增四項治療分析：何時治療、何時復發、參數多敏感、間歇治療是否有用。</w:t>
       </w:r>
     </w:p>
     <w:p>
@@ -225,7 +225,7 @@
                 <w:rFonts w:ascii="Helvetica Neue" w:hAnsi="Helvetica Neue" w:eastAsia="PingFang TC"/>
                 <w:sz w:val="19"/>
               </w:rPr>
-              <w:t>06C、基因頻率圖、PCA</w:t>
+              <w:t>06C、基因頻率圖、10</w:t>
             </w:r>
           </w:p>
         </w:tc>
@@ -239,7 +239,7 @@
                 <w:rFonts w:ascii="Helvetica Neue" w:hAnsi="Helvetica Neue" w:eastAsia="PingFang TC"/>
                 <w:sz w:val="19"/>
               </w:rPr>
-              <w:t>oncogene 讓子代數從 1.428 升到 1.685；治療前的成長漂移完全由 oncogene 比例決定。</w:t>
+              <w:t>oncogene 讓子代數從 1.428 升到 1.685；帶 oncogene 的抗藥細胞讓「治得好」所需的殺傷率從 0.30 提高到 0.41。</w:t>
             </w:r>
           </w:p>
         </w:tc>
@@ -327,7 +327,7 @@
                 <w:rFonts w:ascii="Helvetica Neue" w:hAnsi="Helvetica Neue" w:eastAsia="PingFang TC"/>
                 <w:sz w:val="19"/>
               </w:rPr>
-              <w:t>同樣取 5,000 個細胞，死亡率 0.20 → 0.45 時 Shannon 多樣性從 1.06 升到 2.83，因為需要的代數從 8 增加到 26。</w:t>
+              <w:t>同樣取 5,000 個細胞，死亡率 0.20 → 0.45 時 Shannon 多樣性從 1.06 升到 2.83，因為需要的代數從 8 增加到 26.5。</w:t>
             </w:r>
           </w:p>
         </w:tc>
@@ -357,7 +357,7 @@
                 <w:rFonts w:ascii="Helvetica Neue" w:hAnsi="Helvetica Neue" w:eastAsia="PingFang TC"/>
                 <w:sz w:val="19"/>
               </w:rPr>
-              <w:t>01、Muller、相圖 01／05、PCA</w:t>
+              <w:t>01、Muller、相圖 01／05、08–11</w:t>
             </w:r>
           </w:p>
         </w:tc>
@@ -371,7 +371,7 @@
                 <w:rFonts w:ascii="Helvetica Neue" w:hAnsi="Helvetica Neue" w:eastAsia="PingFang TC"/>
                 <w:sz w:val="19"/>
               </w:rPr>
-              <w:t>30/30 次試驗都復發；抗藥細胞在治療前就已存在。抗藥比例越過約 70% 時，腫瘤由縮小轉為長大。</w:t>
+              <w:t>30/30 次試驗都復發；抗藥細胞在治療前就已存在。腫瘤在約 400 個細胞前治療，治癒機率才超過一半；復發時間可由治療開始時的抗藥細胞準確預測。</w:t>
             </w:r>
           </w:p>
         </w:tc>
@@ -1000,7 +1000,7 @@
         <w:rPr>
           <w:rFonts w:ascii="Helvetica Neue" w:hAnsi="Helvetica Neue" w:eastAsia="PingFang TC"/>
         </w:rPr>
-        <w:t>線性座標只看得到幾千到幾萬個細胞，小族群擠在原點附近。對數座標的版本（舊相圖 04）已刪除：它唯一的新資訊是「大族群會持續供應抗藥突變」，這點在相圖 05 上排與 PCA 的組成方向都看得到。截面假設沒有 oncogene 細胞。</w:t>
+        <w:t>線性座標只看得到幾千到幾萬個細胞，小族群擠在原點附近。對數座標的版本（舊相圖 04）已刪除：它唯一的新資訊是「大族群會持續供應抗藥突變」，這點在相圖 05 上排與圖 08B 都看得到。截面假設沒有 oncogene 細胞。</w:t>
       </w:r>
     </w:p>
     <w:p>
@@ -2011,7 +2011,7 @@
         <w:rPr>
           <w:rFonts w:ascii="Helvetica Neue" w:hAnsi="Helvetica Neue" w:eastAsia="PingFang TC"/>
         </w:rPr>
-        <w:t xml:space="preserve"> 維，平面只能放兩個數字。所以每張相圖都是投影。原本 7 張相圖現在精簡為 3 張：實際軌跡（相圖 01）、理論 vs 實際（相圖 05）、適應度版本（相圖 06，備用）；「為什麼選這兩個軸」由第 5 節的 PCA 回答。</w:t>
+        <w:t xml:space="preserve"> 維，平面只能放兩個數字。所以每張相圖都是投影。原本 7 張相圖現在精簡為 3 張：實際軌跡（相圖 01）、理論 vs 實際（相圖 05）、適應度版本（相圖 06，備用）。</w:t>
       </w:r>
     </w:p>
     <w:p>
@@ -2342,7 +2342,7 @@
         <w:rPr>
           <w:rFonts w:ascii="Helvetica Neue" w:hAnsi="Helvetica Neue" w:eastAsia="PingFang TC"/>
         </w:rPr>
-        <w:t>相圖系列的總結。上排用模型公式算，下排直接平均真實模擬的下一步。兩排一致，就代表「敏感 vs 抗藥」兩群足以解釋現象。第 5 節的 PCA 解釋了為什麼這兩個軸最好：治療中，抗藥比例 ρ 幾乎單獨決定負荷往上或往下。</w:t>
+        <w:t>相圖系列的總結。上排用模型公式算，下排直接平均真實模擬的下一步。兩排一致，就代表「敏感 vs 抗藥」兩群足以解釋現象。治療中，抗藥比例 ρ 幾乎單獨決定負荷往上或往下（圖 09C），所以縱軸用 ρ。</w:t>
       </w:r>
     </w:p>
     <w:p>
@@ -2678,7 +2678,7 @@
         <w:rPr>
           <w:rFonts w:ascii="Helvetica Neue" w:hAnsi="Helvetica Neue" w:eastAsia="PingFang TC"/>
         </w:rPr>
-        <w:t>05 誰決定走向：PCA 與漂移分解</w:t>
+        <w:t>05 治療延伸分析：何時治、何時復發</w:t>
       </w:r>
     </w:p>
     <w:p>
@@ -2686,7 +2686,7 @@
         <w:rPr>
           <w:rFonts w:ascii="Helvetica Neue" w:hAnsi="Helvetica Neue" w:eastAsia="PingFang TC"/>
         </w:rPr>
-        <w:t>PCA 找的是「變異最大」的方向，但變異大不代表會決定腫瘤下一步往哪走。這一節把兩件事分開：先用 PCA 看狀態量怎麼一起變，再直接問「哪一組因子決定了下一步的期望方向」。</w:t>
+        <w:t>主實驗只回答「固定在 20,000 個細胞開始治療會怎樣」。這一節用同一個模型問四個臨床上會問的問題。每一項都先寫出可以從模型規則直接推出的理論，再用模擬檢查。</w:t>
       </w:r>
     </w:p>
     <w:p>
@@ -2697,7 +2697,7 @@
         <w:rPr>
           <w:rFonts w:ascii="Helvetica Neue" w:hAnsi="Helvetica Neue" w:eastAsia="PingFang TC"/>
         </w:rPr>
-        <w:t>PCA 與漂移分解 哪個因子決定腫瘤往哪走</w:t>
+        <w:t>圖 08 Goldie–Coldman：越早治療越可能治癒</w:t>
       </w:r>
     </w:p>
     <w:p>
@@ -2707,7 +2707,7 @@
           <w:color w:val="56666F"/>
           <w:sz w:val="17"/>
         </w:rPr>
-        <w:t>outputs/phase_coordinates/05_phase_coordinate_pca_zh.png</w:t>
+        <w:t>outputs/therapy_analysis/08_goldie_coldman.png</w:t>
       </w:r>
       <w:r>
         <w:rPr>
@@ -2739,7 +2739,7 @@
       <w:r>
         <w:drawing>
           <wp:inline xmlns:a="http://schemas.openxmlformats.org/drawingml/2006/main" xmlns:pic="http://schemas.openxmlformats.org/drawingml/2006/picture">
-            <wp:extent cx="5943600" cy="3680079"/>
+            <wp:extent cx="5943600" cy="2092642"/>
             <wp:docPr id="9" name="Picture 9"/>
             <wp:cNvGraphicFramePr>
               <a:graphicFrameLocks noChangeAspect="1"/>
@@ -2748,7 +2748,7 @@
               <a:graphicData uri="http://schemas.openxmlformats.org/drawingml/2006/picture">
                 <pic:pic>
                   <pic:nvPicPr>
-                    <pic:cNvPr id="0" name="phase_coordinates-05_phase_coordinate_pca_zh.jpg"/>
+                    <pic:cNvPr id="0" name="therapy_analysis-08_goldie_coldman.jpg"/>
                     <pic:cNvPicPr/>
                   </pic:nvPicPr>
                   <pic:blipFill>
@@ -2760,7 +2760,7 @@
                   <pic:spPr>
                     <a:xfrm>
                       <a:off x="0" y="0"/>
-                      <a:ext cx="5943600" cy="3680079"/>
+                      <a:ext cx="5943600" cy="2092642"/>
                     </a:xfrm>
                     <a:prstGeom prst="rect"/>
                   </pic:spPr>
@@ -2790,46 +2790,7 @@
         <w:rPr>
           <w:rFonts w:ascii="Helvetica Neue" w:hAnsi="Helvetica Neue" w:eastAsia="PingFang TC"/>
         </w:rPr>
-        <w:t>把 1,119 個（試驗×世代）狀態的 15 個生物狀態量拿來分析，回答兩個問題：哪些量會一起變（PCA），以及</w:t>
-      </w:r>
-      <w:r>
-        <w:rPr>
-          <w:rFonts w:ascii="Helvetica Neue" w:hAnsi="Helvetica Neue" w:eastAsia="PingFang TC"/>
-          <w:b/>
-        </w:rPr>
-        <w:t>哪一組因子真正決定下一步</w:t>
-      </w:r>
-      <w:r>
-        <w:rPr>
-          <w:rFonts w:ascii="Helvetica Neue" w:hAnsi="Helvetica Neue" w:eastAsia="PingFang TC"/>
-        </w:rPr>
-        <w:t>。每一步拆成兩部分：由當代完整基因型組成精確算出的</w:t>
-      </w:r>
-      <w:r>
-        <w:rPr>
-          <w:rFonts w:ascii="Helvetica Neue" w:hAnsi="Helvetica Neue" w:eastAsia="PingFang TC"/>
-          <w:b/>
-        </w:rPr>
-        <w:t>期望漂移</w:t>
-      </w:r>
-      <w:r>
-        <w:rPr>
-          <w:rFonts w:ascii="Helvetica Neue" w:hAnsi="Helvetica Neue" w:eastAsia="PingFang TC"/>
-        </w:rPr>
-        <w:t>，加上</w:t>
-      </w:r>
-      <w:r>
-        <w:rPr>
-          <w:rFonts w:ascii="Helvetica Neue" w:hAnsi="Helvetica Neue" w:eastAsia="PingFang TC"/>
-          <w:b/>
-        </w:rPr>
-        <w:t>隨機噪音</w:t>
-      </w:r>
-      <w:r>
-        <w:rPr>
-          <w:rFonts w:ascii="Helvetica Neue" w:hAnsi="Helvetica Neue" w:eastAsia="PingFang TC"/>
-        </w:rPr>
-        <w:t>。走向也分成兩個方向：負荷方向（Δ ln N）和組成方向（Δ logit ρ）。</w:t>
+        <w:t>Goldie 與 Coldman（1979）指出：抗藥突變會隨腫瘤長大而累積，所以治療越晚，抗藥細胞越可能已經存在。這張把治療起始負荷從 100 掃到 5,000 個細胞，每個大小跑 200 次試驗，直接量出治癒機率。</w:t>
       </w:r>
     </w:p>
     <w:p>
@@ -2862,7 +2823,7 @@
         <w:rPr>
           <w:rFonts w:ascii="Helvetica Neue" w:hAnsi="Helvetica Neue" w:eastAsia="PingFang TC"/>
         </w:rPr>
-        <w:t>：長條是每個主成分解釋多少變異；圓點是只用該主成分能解釋多少負荷漂移（R²）。治療前、治療中分開做。</w:t>
+        <w:t>：橫軸是開始持續治療時的負荷（log），縱軸是治癒（腫瘤滅絕）比例，誤差棒是 Wilson 95% 區間。黑色階梯線是理論。</w:t>
       </w:r>
     </w:p>
     <w:p>
@@ -2880,7 +2841,33 @@
         <w:rPr>
           <w:rFonts w:ascii="Helvetica Neue" w:hAnsi="Helvetica Neue" w:eastAsia="PingFang TC"/>
         </w:rPr>
-        <w:t>：主成分負荷。列標籤的顏色代表因子組（負荷、抗藥、oncogene、TSG、多樣性、時間）。</w:t>
+        <w:t>：治療開始時已有的抗藥細胞數 R</w:t>
+      </w:r>
+      <w:r>
+        <w:rPr>
+          <w:rFonts w:ascii="Helvetica Neue" w:hAnsi="Helvetica Neue" w:eastAsia="PingFang TC"/>
+          <w:vertAlign w:val="subscript"/>
+        </w:rPr>
+        <w:t>0</w:t>
+      </w:r>
+      <w:r>
+        <w:rPr>
+          <w:rFonts w:ascii="Helvetica Neue" w:hAnsi="Helvetica Neue" w:eastAsia="PingFang TC"/>
+        </w:rPr>
+        <w:t>（平均、中位數），灰色百分比是 R</w:t>
+      </w:r>
+      <w:r>
+        <w:rPr>
+          <w:rFonts w:ascii="Helvetica Neue" w:hAnsi="Helvetica Neue" w:eastAsia="PingFang TC"/>
+          <w:vertAlign w:val="subscript"/>
+        </w:rPr>
+        <w:t>0</w:t>
+      </w:r>
+      <w:r>
+        <w:rPr>
+          <w:rFonts w:ascii="Helvetica Neue" w:hAnsi="Helvetica Neue" w:eastAsia="PingFang TC"/>
+        </w:rPr>
+        <w:t xml:space="preserve"> = 0 的試驗比例。</w:t>
       </w:r>
     </w:p>
     <w:p>
@@ -2890,103 +2877,58 @@
       <w:r>
         <w:rPr>
           <w:rFonts w:ascii="Helvetica Neue" w:hAnsi="Helvetica Neue" w:eastAsia="PingFang TC"/>
-          <w:b/>
-        </w:rPr>
-        <w:t>C</w:t>
-      </w:r>
-      <w:r>
-        <w:rPr>
-          <w:rFonts w:ascii="Helvetica Neue" w:hAnsi="Helvetica Neue" w:eastAsia="PingFang TC"/>
-        </w:rPr>
-        <w:t>：每組因子單獨能解釋多少期望漂移（R²），四欄是「治療前／中 × 負荷／組成方向」。黑框是該方向最主導的一組。最下一列是「期望漂移占實際步伐的比例」，越低代表隨機噪音越大。</w:t>
-      </w:r>
-    </w:p>
-    <w:p>
-      <w:pPr>
-        <w:pStyle w:val="ListBullet"/>
-      </w:pPr>
-      <w:r>
-        <w:rPr>
-          <w:rFonts w:ascii="Helvetica Neue" w:hAnsi="Helvetica Neue" w:eastAsia="PingFang TC"/>
-          <w:b/>
-        </w:rPr>
-        <w:t>D</w:t>
-      </w:r>
-      <w:r>
-        <w:rPr>
-          <w:rFonts w:ascii="Helvetica Neue" w:hAnsi="Helvetica Neue" w:eastAsia="PingFang TC"/>
-        </w:rPr>
-        <w:t>：治療前，成長率對 oncogene 比例。藍點是期望漂移，灰點是實際一步，黑線是理論 ln[(1−f)w</w:t>
+        </w:rPr>
+        <w:t>理論：抗藥突變以 Poisson 過程出現；第 s 代出生的突變 clone 先未治療繁殖到治療開始，之後在治療下最終存活的機率是 1 − f</w:t>
+      </w:r>
+      <w:r>
+        <w:rPr>
+          <w:rFonts w:ascii="Helvetica Neue" w:hAnsi="Helvetica Neue" w:eastAsia="PingFang TC"/>
+        </w:rPr>
+        <w:t>(T−s)</w:t>
+      </w:r>
+      <w:r>
+        <w:rPr>
+          <w:rFonts w:ascii="Helvetica Neue" w:hAnsi="Helvetica Neue" w:eastAsia="PingFang TC"/>
+        </w:rPr>
+        <w:t>(q</w:t>
       </w:r>
       <w:r>
         <w:rPr>
           <w:rFonts w:ascii="Helvetica Neue" w:hAnsi="Helvetica Neue" w:eastAsia="PingFang TC"/>
           <w:vertAlign w:val="subscript"/>
         </w:rPr>
-        <w:t>0</w:t>
-      </w:r>
-      <w:r>
-        <w:rPr>
-          <w:rFonts w:ascii="Helvetica Neue" w:hAnsi="Helvetica Neue" w:eastAsia="PingFang TC"/>
-        </w:rPr>
-        <w:t xml:space="preserve"> + f w</w:t>
+        <w:t>on</w:t>
+      </w:r>
+      <w:r>
+        <w:rPr>
+          <w:rFonts w:ascii="Helvetica Neue" w:hAnsi="Helvetica Neue" w:eastAsia="PingFang TC"/>
+        </w:rPr>
+        <w:t>)，其中 q</w:t>
       </w:r>
       <w:r>
         <w:rPr>
           <w:rFonts w:ascii="Helvetica Neue" w:hAnsi="Helvetica Neue" w:eastAsia="PingFang TC"/>
           <w:vertAlign w:val="subscript"/>
         </w:rPr>
-        <w:t>1</w:t>
-      </w:r>
-      <w:r>
-        <w:rPr>
-          <w:rFonts w:ascii="Helvetica Neue" w:hAnsi="Helvetica Neue" w:eastAsia="PingFang TC"/>
-        </w:rPr>
-        <w:t>]。</w:t>
-      </w:r>
-    </w:p>
-    <w:p>
-      <w:pPr>
-        <w:pStyle w:val="ListBullet"/>
-      </w:pPr>
-      <w:r>
-        <w:rPr>
-          <w:rFonts w:ascii="Helvetica Neue" w:hAnsi="Helvetica Neue" w:eastAsia="PingFang TC"/>
-          <w:b/>
-        </w:rPr>
-        <w:t>E</w:t>
-      </w:r>
-      <w:r>
-        <w:rPr>
-          <w:rFonts w:ascii="Helvetica Neue" w:hAnsi="Helvetica Neue" w:eastAsia="PingFang TC"/>
-        </w:rPr>
-        <w:t>：治療中，期望成長率對抗藥比例 ρ，點的顏色是 oncogene 比例。黑線是理論 ln[(1−ρ)w</w:t>
-      </w:r>
-      <w:r>
-        <w:rPr>
-          <w:rFonts w:ascii="Helvetica Neue" w:hAnsi="Helvetica Neue" w:eastAsia="PingFang TC"/>
-          <w:vertAlign w:val="subscript"/>
-        </w:rPr>
-        <w:t>S</w:t>
-      </w:r>
-      <w:r>
-        <w:rPr>
-          <w:rFonts w:ascii="Helvetica Neue" w:hAnsi="Helvetica Neue" w:eastAsia="PingFang TC"/>
-        </w:rPr>
-        <w:t xml:space="preserve"> + ρ w</w:t>
-      </w:r>
-      <w:r>
-        <w:rPr>
-          <w:rFonts w:ascii="Helvetica Neue" w:hAnsi="Helvetica Neue" w:eastAsia="PingFang TC"/>
-          <w:vertAlign w:val="subscript"/>
-        </w:rPr>
-        <w:t>R</w:t>
-      </w:r>
-      <w:r>
-        <w:rPr>
-          <w:rFonts w:ascii="Helvetica Neue" w:hAnsi="Helvetica Neue" w:eastAsia="PingFang TC"/>
-        </w:rPr>
-        <w:t>]，紅虛線是成長率為零的 ρ*。</w:t>
+        <w:t>on</w:t>
+      </w:r>
+      <w:r>
+        <w:rPr>
+          <w:rFonts w:ascii="Helvetica Neue" w:hAnsi="Helvetica Neue" w:eastAsia="PingFang TC"/>
+        </w:rPr>
+        <w:t xml:space="preserve"> = 0.479 是一個抗藥家系在治療下滅絕的機率（圖 06C）。治癒 = 沒有任何抗藥家系存活 ≈ e</w:t>
+      </w:r>
+      <w:r>
+        <w:rPr>
+          <w:rFonts w:ascii="Helvetica Neue" w:hAnsi="Helvetica Neue" w:eastAsia="PingFang TC"/>
+        </w:rPr>
+        <w:t>−Λ</w:t>
+      </w:r>
+      <w:r>
+        <w:rPr>
+          <w:rFonts w:ascii="Helvetica Neue" w:hAnsi="Helvetica Neue" w:eastAsia="PingFang TC"/>
+        </w:rPr>
+        <w:t>。理論是階梯狀，因為治療只在整數世代開始。</w:t>
       </w:r>
     </w:p>
     <w:p>
@@ -3011,15 +2953,21 @@
       <w:r>
         <w:rPr>
           <w:rFonts w:ascii="Helvetica Neue" w:hAnsi="Helvetica Neue" w:eastAsia="PingFang TC"/>
+        </w:rPr>
+        <w:t>理論與模擬幾乎重合，</w:t>
+      </w:r>
+      <w:r>
+        <w:rPr>
+          <w:rFonts w:ascii="Helvetica Neue" w:hAnsi="Helvetica Neue" w:eastAsia="PingFang TC"/>
           <w:b/>
         </w:rPr>
-        <w:t>PC1 是「隨時間一起變大」的量</w:t>
-      </w:r>
-      <w:r>
-        <w:rPr>
-          <w:rFonts w:ascii="Helvetica Neue" w:hAnsi="Helvetica Neue" w:eastAsia="PingFang TC"/>
-        </w:rPr>
-        <w:t>（負荷、多樣性、passenger、oncogene），治療前占 67% 變異、治療中占 59%。治療前它能預測漂移（R² 0.74），但那只是因為 oncogene 也隨時間累積；治療中光靠 PC1 只有 0.36，要加上以 ρ 為主的 PC2（0.55）。</w:t>
+        <w:t>沒有任何擬合參數</w:t>
+      </w:r>
+      <w:r>
+        <w:rPr>
+          <w:rFonts w:ascii="Helvetica Neue" w:hAnsi="Helvetica Neue" w:eastAsia="PingFang TC"/>
+        </w:rPr>
+        <w:t>，所有數字都來自模型規則。</w:t>
       </w:r>
     </w:p>
     <w:p>
@@ -3029,15 +2977,44 @@
       <w:r>
         <w:rPr>
           <w:rFonts w:ascii="Helvetica Neue" w:hAnsi="Helvetica Neue" w:eastAsia="PingFang TC"/>
-          <w:b/>
-        </w:rPr>
-        <w:t>治療前：oncogene 比例決定漂移</w:t>
-      </w:r>
-      <w:r>
-        <w:rPr>
-          <w:rFonts w:ascii="Helvetica Neue" w:hAnsi="Helvetica Neue" w:eastAsia="PingFang TC"/>
-        </w:rPr>
-        <w:t xml:space="preserve">（R² = 1.00，因為期望成長率就是 ln w̄，而 w̄ 由 oncogene 比例決定）。但漂移本身每代只差 ±0.009，小族群的隨機噪音大得多，所以實際一步只有 </w:t>
+        </w:rPr>
+        <w:t xml:space="preserve">100 個細胞就治療：治癒 </w:t>
+      </w:r>
+      <w:r>
+        <w:rPr>
+          <w:rFonts w:ascii="Helvetica Neue" w:hAnsi="Helvetica Neue" w:eastAsia="PingFang TC"/>
+        </w:rPr>
+        <w:t>99.5%</w:t>
+      </w:r>
+      <w:r>
+        <w:rPr>
+          <w:rFonts w:ascii="Helvetica Neue" w:hAnsi="Helvetica Neue" w:eastAsia="PingFang TC"/>
+        </w:rPr>
+        <w:t>；300：</w:t>
+      </w:r>
+      <w:r>
+        <w:rPr>
+          <w:rFonts w:ascii="Helvetica Neue" w:hAnsi="Helvetica Neue" w:eastAsia="PingFang TC"/>
+        </w:rPr>
+        <w:t>60.5%</w:t>
+      </w:r>
+      <w:r>
+        <w:rPr>
+          <w:rFonts w:ascii="Helvetica Neue" w:hAnsi="Helvetica Neue" w:eastAsia="PingFang TC"/>
+        </w:rPr>
+        <w:t>；500：</w:t>
+      </w:r>
+      <w:r>
+        <w:rPr>
+          <w:rFonts w:ascii="Helvetica Neue" w:hAnsi="Helvetica Neue" w:eastAsia="PingFang TC"/>
+        </w:rPr>
+        <w:t>40%</w:t>
+      </w:r>
+      <w:r>
+        <w:rPr>
+          <w:rFonts w:ascii="Helvetica Neue" w:hAnsi="Helvetica Neue" w:eastAsia="PingFang TC"/>
+        </w:rPr>
+        <w:t>；1,000：</w:t>
       </w:r>
       <w:r>
         <w:rPr>
@@ -3049,7 +3026,31 @@
         <w:rPr>
           <w:rFonts w:ascii="Helvetica Neue" w:hAnsi="Helvetica Neue" w:eastAsia="PingFang TC"/>
         </w:rPr>
-        <w:t xml:space="preserve"> 是可預測的（D 的灰點雲）。</w:t>
+        <w:t>；5,000：</w:t>
+      </w:r>
+      <w:r>
+        <w:rPr>
+          <w:rFonts w:ascii="Helvetica Neue" w:hAnsi="Helvetica Neue" w:eastAsia="PingFang TC"/>
+        </w:rPr>
+        <w:t>0%</w:t>
+      </w:r>
+      <w:r>
+        <w:rPr>
+          <w:rFonts w:ascii="Helvetica Neue" w:hAnsi="Helvetica Neue" w:eastAsia="PingFang TC"/>
+        </w:rPr>
+        <w:t xml:space="preserve">。理論的 50% 點約在 </w:t>
+      </w:r>
+      <w:r>
+        <w:rPr>
+          <w:rFonts w:ascii="Helvetica Neue" w:hAnsi="Helvetica Neue" w:eastAsia="PingFang TC"/>
+        </w:rPr>
+        <w:t>416</w:t>
+      </w:r>
+      <w:r>
+        <w:rPr>
+          <w:rFonts w:ascii="Helvetica Neue" w:hAnsi="Helvetica Neue" w:eastAsia="PingFang TC"/>
+        </w:rPr>
+        <w:t xml:space="preserve"> 個細胞。主實驗的 20,000 個細胞遠遠超過這個範圍，所以 30/30 都復發。</w:t>
       </w:r>
     </w:p>
     <w:p>
@@ -3059,27 +3060,8 @@
       <w:r>
         <w:rPr>
           <w:rFonts w:ascii="Helvetica Neue" w:hAnsi="Helvetica Neue" w:eastAsia="PingFang TC"/>
-          <w:b/>
-        </w:rPr>
-        <w:t>治療中：抗藥比例 ρ 決定負荷漲跌</w:t>
-      </w:r>
-      <w:r>
-        <w:rPr>
-          <w:rFonts w:ascii="Helvetica Neue" w:hAnsi="Helvetica Neue" w:eastAsia="PingFang TC"/>
-        </w:rPr>
-        <w:t xml:space="preserve">（R² = 0.97），而且實際一步幾乎完全等於漂移（1.00）。E 的曲線在 </w:t>
-      </w:r>
-      <w:r>
-        <w:rPr>
-          <w:rFonts w:ascii="Helvetica Neue" w:hAnsi="Helvetica Neue" w:eastAsia="PingFang TC"/>
-        </w:rPr>
-        <w:t>ρ* = 70%</w:t>
-      </w:r>
-      <w:r>
-        <w:rPr>
-          <w:rFonts w:ascii="Helvetica Neue" w:hAnsi="Helvetica Neue" w:eastAsia="PingFang TC"/>
-        </w:rPr>
-        <w:t xml:space="preserve"> 穿過零：ρ 低於這個值腫瘤縮小，高於這個值腫瘤長大。這就是谷底的位置。</w:t>
+        </w:rPr>
+        <w:t>B：抗藥細胞的平均數大於中位數，這是 Luria–Delbrück 的特徵：少數試驗很早就出現突變（「jackpot」），之後一起長大成很大的 clone。</w:t>
       </w:r>
     </w:p>
     <w:p>
@@ -3090,87 +3072,57 @@
         <w:rPr>
           <w:rFonts w:ascii="Helvetica Neue" w:hAnsi="Helvetica Neue" w:eastAsia="PingFang TC"/>
         </w:rPr>
-        <w:t>帶 oncogene 的點落在理論曲線上方（顏色越亮越高），所以實際由負轉正發生在 ρ ≈ 65%，比理論的 70% 早。這是 oncogene 唯一明顯影響治療中走向的地方。</w:t>
+        <w:t>就算治療開始時 R</w:t>
+      </w:r>
+      <w:r>
+        <w:rPr>
+          <w:rFonts w:ascii="Helvetica Neue" w:hAnsi="Helvetica Neue" w:eastAsia="PingFang TC"/>
+          <w:vertAlign w:val="subscript"/>
+        </w:rPr>
+        <w:t>0</w:t>
+      </w:r>
+      <w:r>
+        <w:rPr>
+          <w:rFonts w:ascii="Helvetica Neue" w:hAnsi="Helvetica Neue" w:eastAsia="PingFang TC"/>
+        </w:rPr>
+        <w:t xml:space="preserve"> = 0，也不保證治癒：治療中殘存的敏感細胞還會分裂並突變出新的抗藥細胞。</w:t>
       </w:r>
     </w:p>
     <w:p>
       <w:pPr>
-        <w:pStyle w:val="ListBullet"/>
+        <w:keepNext/>
+        <w:spacing w:after="0"/>
       </w:pPr>
       <w:r>
         <w:rPr>
           <w:rFonts w:ascii="Helvetica Neue" w:hAnsi="Helvetica Neue" w:eastAsia="PingFang TC"/>
           <w:b/>
-        </w:rPr>
-        <w:t>組成方向兩段都由 ρ 自己決定</w:t>
-      </w:r>
-      <w:r>
-        <w:rPr>
-          <w:rFonts w:ascii="Helvetica Neue" w:hAnsi="Helvetica Neue" w:eastAsia="PingFang TC"/>
-        </w:rPr>
-        <w:t>：治療前是突變供應（R 越少，logit ρ 跳得越多），治療中是篩選。</w:t>
+          <w:color w:val="A9661A"/>
+        </w:rPr>
+        <w:t>限制</w:t>
       </w:r>
     </w:p>
     <w:p>
-      <w:pPr>
-        <w:keepNext/>
-        <w:spacing w:after="0"/>
-      </w:pPr>
-      <w:r>
-        <w:rPr>
-          <w:rFonts w:ascii="Helvetica Neue" w:hAnsi="Helvetica Neue" w:eastAsia="PingFang TC"/>
-          <w:b/>
-          <w:color w:val="A9661A"/>
-        </w:rPr>
-        <w:t>限制</w:t>
+      <w:r>
+        <w:rPr>
+          <w:rFonts w:ascii="Helvetica Neue" w:hAnsi="Helvetica Neue" w:eastAsia="PingFang TC"/>
+        </w:rPr>
+        <w:t>理論只用基準細胞（忽略 oncogene 讓腫瘤長得較快），所以在大負荷時稍微高估治癒機率。模型沒有免疫與空間結構；臨床上的「偵測大小」通常是 10</w:t>
+      </w:r>
+      <w:r>
+        <w:rPr>
+          <w:rFonts w:ascii="Helvetica Neue" w:hAnsi="Helvetica Neue" w:eastAsia="PingFang TC"/>
+        </w:rPr>
+        <w:t>9</w:t>
+      </w:r>
+      <w:r>
+        <w:rPr>
+          <w:rFonts w:ascii="Helvetica Neue" w:hAnsi="Helvetica Neue" w:eastAsia="PingFang TC"/>
+        </w:rPr>
+        <w:t xml:space="preserve"> 個細胞，數值不能直接套用。</w:t>
       </w:r>
     </w:p>
     <w:p>
-      <w:r>
-        <w:rPr>
-          <w:rFonts w:ascii="Helvetica Neue" w:hAnsi="Helvetica Neue" w:eastAsia="PingFang TC"/>
-        </w:rPr>
-        <w:t>R² 只代表相關：多樣性、負荷也隨時間上升，所以 C 中它們的 R² 偏高（例如治療前多樣性 0.86），但在模型裡它們不會直接改變平均子代數。只有黑框的因子在規則中直接進入 m。組成方向只用 S &gt; 0 的狀態（治療中 169 個）。所有分析只用基礎模型（IL11 關閉）。</w:t>
-      </w:r>
-    </w:p>
-    <w:p>
-      <w:pPr>
-        <w:shd w:val="clear" w:color="auto" w:fill="E8F0F3"/>
-      </w:pPr>
-      <w:r>
-        <w:rPr>
-          <w:rFonts w:ascii="Helvetica Neue" w:hAnsi="Helvetica Neue" w:eastAsia="PingFang TC"/>
-          <w:b/>
-        </w:rPr>
-        <w:t>一句話：</w:t>
-      </w:r>
-      <w:r>
-        <w:rPr>
-          <w:rFonts w:ascii="Helvetica Neue" w:hAnsi="Helvetica Neue" w:eastAsia="PingFang TC"/>
-        </w:rPr>
-        <w:t>變異最大的是時間，決定走向的是適應度。治療前，適應度由 oncogene 比例決定，但噪音蓋過訊號；治療中，適應度由抗藥比例決定，ρ 越過 70% 就是復發的開始。這也是相圖 05 選 (log N, logit ρ) 當座標的理由。</w:t>
-      </w:r>
-    </w:p>
-    <w:p>
-      <w:pPr>
-        <w:pStyle w:val="Heading1"/>
-      </w:pPr>
-      <w:r>
-        <w:rPr>
-          <w:rFonts w:ascii="Helvetica Neue" w:hAnsi="Helvetica Neue" w:eastAsia="PingFang TC"/>
-        </w:rPr>
-        <w:t>06 對照實驗：TSG 與死亡率</w:t>
-      </w:r>
-    </w:p>
-    <w:p>
-      <w:r>
-        <w:rPr>
-          <w:rFonts w:ascii="Helvetica Neue" w:hAnsi="Helvetica Neue" w:eastAsia="PingFang TC"/>
-        </w:rPr>
-        <w:t>這兩張回答作業建議的兩個情境。原則是「一次只改一件事」：除了被比較的規則外，所有參數、基因數和突變率都相同，而且都不加治療。</w:t>
-      </w:r>
-    </w:p>
-    <w:p>
       <w:pPr>
         <w:pStyle w:val="Heading2"/>
       </w:pPr>
@@ -3178,7 +3130,7 @@
         <w:rPr>
           <w:rFonts w:ascii="Helvetica Neue" w:hAnsi="Helvetica Neue" w:eastAsia="PingFang TC"/>
         </w:rPr>
-        <w:t>圖 03 One-hit vs two-hit（含對照組）</w:t>
+        <w:t>圖 09 復發時間可以從治療開始時的抗藥細胞預測</w:t>
       </w:r>
     </w:p>
     <w:p>
@@ -3188,7 +3140,7 @@
           <w:color w:val="56666F"/>
           <w:sz w:val="17"/>
         </w:rPr>
-        <w:t>outputs/03_one_hit_vs_two_hit.png</w:t>
+        <w:t>outputs/therapy_analysis/09_relapse_time_prediction.png</w:t>
       </w:r>
       <w:r>
         <w:rPr>
@@ -3220,8 +3172,883 @@
       <w:r>
         <w:drawing>
           <wp:inline xmlns:a="http://schemas.openxmlformats.org/drawingml/2006/main" xmlns:pic="http://schemas.openxmlformats.org/drawingml/2006/picture">
+            <wp:extent cx="5943600" cy="1993582"/>
+            <wp:docPr id="10" name="Picture 10"/>
+            <wp:cNvGraphicFramePr>
+              <a:graphicFrameLocks noChangeAspect="1"/>
+            </wp:cNvGraphicFramePr>
+            <a:graphic>
+              <a:graphicData uri="http://schemas.openxmlformats.org/drawingml/2006/picture">
+                <pic:pic>
+                  <pic:nvPicPr>
+                    <pic:cNvPr id="0" name="therapy_analysis-09_relapse_time_prediction.jpg"/>
+                    <pic:cNvPicPr/>
+                  </pic:nvPicPr>
+                  <pic:blipFill>
+                    <a:blip r:embed="rId18"/>
+                    <a:stretch>
+                      <a:fillRect/>
+                    </a:stretch>
+                  </pic:blipFill>
+                  <pic:spPr>
+                    <a:xfrm>
+                      <a:off x="0" y="0"/>
+                      <a:ext cx="5943600" cy="1993582"/>
+                    </a:xfrm>
+                    <a:prstGeom prst="rect"/>
+                  </pic:spPr>
+                </pic:pic>
+              </a:graphicData>
+            </a:graphic>
+          </wp:inline>
+        </w:drawing>
+      </w:r>
+    </w:p>
+    <w:p>
+      <w:pPr>
+        <w:keepNext/>
+        <w:spacing w:after="0"/>
+      </w:pPr>
+      <w:r>
+        <w:rPr>
+          <w:rFonts w:ascii="Helvetica Neue" w:hAnsi="Helvetica Neue" w:eastAsia="PingFang TC"/>
+          <w:b/>
+          <w:color w:val="1E6A86"/>
+        </w:rPr>
+        <w:t>為什麼做</w:t>
+      </w:r>
+    </w:p>
+    <w:p>
+      <w:r>
+        <w:rPr>
+          <w:rFonts w:ascii="Helvetica Neue" w:hAnsi="Helvetica Neue" w:eastAsia="PingFang TC"/>
+        </w:rPr>
+        <w:t>Muller 圖暗示「抗藥細胞剛好帶 oncogene 時復發較早」。這張用主實驗的 30 次試驗正式檢查：只看治療開始那一代的組成，能不能算出復發會在哪一代。</w:t>
+      </w:r>
+    </w:p>
+    <w:p>
+      <w:pPr>
+        <w:keepNext/>
+        <w:spacing w:after="0"/>
+      </w:pPr>
+      <w:r>
+        <w:rPr>
+          <w:rFonts w:ascii="Helvetica Neue" w:hAnsi="Helvetica Neue" w:eastAsia="PingFang TC"/>
+          <w:b/>
+          <w:color w:val="1E6A86"/>
+        </w:rPr>
+        <w:t>怎麼讀</w:t>
+      </w:r>
+    </w:p>
+    <w:p/>
+    <w:p>
+      <w:pPr>
+        <w:pStyle w:val="ListBullet"/>
+      </w:pPr>
+      <w:r>
+        <w:rPr>
+          <w:rFonts w:ascii="Helvetica Neue" w:hAnsi="Helvetica Neue" w:eastAsia="PingFang TC"/>
+          <w:b/>
+        </w:rPr>
+        <w:t>A</w:t>
+      </w:r>
+      <w:r>
+        <w:rPr>
+          <w:rFonts w:ascii="Helvetica Neue" w:hAnsi="Helvetica Neue" w:eastAsia="PingFang TC"/>
+        </w:rPr>
+        <w:t>：橫軸是預測、縱軸是觀察的復發延遲（治療開始後幾代回到起始負荷）。灰點是基準預測 ln(N/R</w:t>
+      </w:r>
+      <w:r>
+        <w:rPr>
+          <w:rFonts w:ascii="Helvetica Neue" w:hAnsi="Helvetica Neue" w:eastAsia="PingFang TC"/>
+          <w:vertAlign w:val="subscript"/>
+        </w:rPr>
+        <w:t>0</w:t>
+      </w:r>
+      <w:r>
+        <w:rPr>
+          <w:rFonts w:ascii="Helvetica Neue" w:hAnsi="Helvetica Neue" w:eastAsia="PingFang TC"/>
+        </w:rPr>
+        <w:t>) / ln 1.371（假設所有抗藥細胞都一樣）；彩色點是組成預測：每種抗藥基因型用自己的治療中平均子代數成長，顏色是其中帶 oncogene 的比例。</w:t>
+      </w:r>
+    </w:p>
+    <w:p>
+      <w:pPr>
+        <w:pStyle w:val="ListBullet"/>
+      </w:pPr>
+      <w:r>
+        <w:rPr>
+          <w:rFonts w:ascii="Helvetica Neue" w:hAnsi="Helvetica Neue" w:eastAsia="PingFang TC"/>
+          <w:b/>
+        </w:rPr>
+        <w:t>B</w:t>
+      </w:r>
+      <w:r>
+        <w:rPr>
+          <w:rFonts w:ascii="Helvetica Neue" w:hAnsi="Helvetica Neue" w:eastAsia="PingFang TC"/>
+        </w:rPr>
+        <w:t>：R</w:t>
+      </w:r>
+      <w:r>
+        <w:rPr>
+          <w:rFonts w:ascii="Helvetica Neue" w:hAnsi="Helvetica Neue" w:eastAsia="PingFang TC"/>
+          <w:vertAlign w:val="subscript"/>
+        </w:rPr>
+        <w:t>0</w:t>
+      </w:r>
+      <w:r>
+        <w:rPr>
+          <w:rFonts w:ascii="Helvetica Neue" w:hAnsi="Helvetica Neue" w:eastAsia="PingFang TC"/>
+        </w:rPr>
+        <w:t xml:space="preserve"> 與觀察到的復發延遲。</w:t>
+      </w:r>
+    </w:p>
+    <w:p>
+      <w:pPr>
+        <w:pStyle w:val="ListBullet"/>
+      </w:pPr>
+      <w:r>
+        <w:rPr>
+          <w:rFonts w:ascii="Helvetica Neue" w:hAnsi="Helvetica Neue" w:eastAsia="PingFang TC"/>
+          <w:b/>
+        </w:rPr>
+        <w:t>C</w:t>
+      </w:r>
+      <w:r>
+        <w:rPr>
+          <w:rFonts w:ascii="Helvetica Neue" w:hAnsi="Helvetica Neue" w:eastAsia="PingFang TC"/>
+        </w:rPr>
+        <w:t>：治療中每個狀態的期望成長率對抗藥比例 ρ，黑線是理論 ln[(1−ρ)m</w:t>
+      </w:r>
+      <w:r>
+        <w:rPr>
+          <w:rFonts w:ascii="Helvetica Neue" w:hAnsi="Helvetica Neue" w:eastAsia="PingFang TC"/>
+          <w:vertAlign w:val="subscript"/>
+        </w:rPr>
+        <w:t>S</w:t>
+      </w:r>
+      <w:r>
+        <w:rPr>
+          <w:rFonts w:ascii="Helvetica Neue" w:hAnsi="Helvetica Neue" w:eastAsia="PingFang TC"/>
+        </w:rPr>
+        <w:t xml:space="preserve"> + ρ m</w:t>
+      </w:r>
+      <w:r>
+        <w:rPr>
+          <w:rFonts w:ascii="Helvetica Neue" w:hAnsi="Helvetica Neue" w:eastAsia="PingFang TC"/>
+          <w:vertAlign w:val="subscript"/>
+        </w:rPr>
+        <w:t>R</w:t>
+      </w:r>
+      <w:r>
+        <w:rPr>
+          <w:rFonts w:ascii="Helvetica Neue" w:hAnsi="Helvetica Neue" w:eastAsia="PingFang TC"/>
+        </w:rPr>
+        <w:t>]。這是原本 PCA 圖唯一保留下來的部分。</w:t>
+      </w:r>
+    </w:p>
+    <w:p>
+      <w:pPr>
+        <w:keepNext/>
+        <w:spacing w:after="0"/>
+      </w:pPr>
+      <w:r>
+        <w:rPr>
+          <w:rFonts w:ascii="Helvetica Neue" w:hAnsi="Helvetica Neue" w:eastAsia="PingFang TC"/>
+          <w:b/>
+          <w:color w:val="1E6A86"/>
+        </w:rPr>
+        <w:t>看到什麼</w:t>
+      </w:r>
+    </w:p>
+    <w:p/>
+    <w:p>
+      <w:pPr>
+        <w:pStyle w:val="ListBullet"/>
+      </w:pPr>
+      <w:r>
+        <w:rPr>
+          <w:rFonts w:ascii="Helvetica Neue" w:hAnsi="Helvetica Neue" w:eastAsia="PingFang TC"/>
+          <w:b/>
+        </w:rPr>
+        <w:t>組成預測幾乎完全命中</w:t>
+      </w:r>
+      <w:r>
+        <w:rPr>
+          <w:rFonts w:ascii="Helvetica Neue" w:hAnsi="Helvetica Neue" w:eastAsia="PingFang TC"/>
+        </w:rPr>
+        <w:t xml:space="preserve">：30 次中 </w:t>
+      </w:r>
+      <w:r>
+        <w:rPr>
+          <w:rFonts w:ascii="Helvetica Neue" w:hAnsi="Helvetica Neue" w:eastAsia="PingFang TC"/>
+        </w:rPr>
+        <w:t>24</w:t>
+      </w:r>
+      <w:r>
+        <w:rPr>
+          <w:rFonts w:ascii="Helvetica Neue" w:hAnsi="Helvetica Neue" w:eastAsia="PingFang TC"/>
+        </w:rPr>
+        <w:t xml:space="preserve"> 次預測到正確的世代，平均誤差 </w:t>
+      </w:r>
+      <w:r>
+        <w:rPr>
+          <w:rFonts w:ascii="Helvetica Neue" w:hAnsi="Helvetica Neue" w:eastAsia="PingFang TC"/>
+        </w:rPr>
+        <w:t>0.2</w:t>
+      </w:r>
+      <w:r>
+        <w:rPr>
+          <w:rFonts w:ascii="Helvetica Neue" w:hAnsi="Helvetica Neue" w:eastAsia="PingFang TC"/>
+        </w:rPr>
+        <w:t xml:space="preserve"> 代。基準預測平均誤差 2.0 代，而且系統性高估（太晚）。</w:t>
+      </w:r>
+    </w:p>
+    <w:p>
+      <w:pPr>
+        <w:pStyle w:val="ListBullet"/>
+      </w:pPr>
+      <w:r>
+        <w:rPr>
+          <w:rFonts w:ascii="Helvetica Neue" w:hAnsi="Helvetica Neue" w:eastAsia="PingFang TC"/>
+        </w:rPr>
+        <w:t>差距全部來自 oncogene：帶 oncogene 的抗藥細胞在治療下每代 ×1.62，單純抗藥細胞只有 ×1.37。最早復發的試驗（左下黃點）有約 65% 的抗藥細胞帶 oncogene。</w:t>
+      </w:r>
+    </w:p>
+    <w:p>
+      <w:pPr>
+        <w:pStyle w:val="ListBullet"/>
+      </w:pPr>
+      <w:r>
+        <w:rPr>
+          <w:rFonts w:ascii="Helvetica Neue" w:hAnsi="Helvetica Neue" w:eastAsia="PingFang TC"/>
+        </w:rPr>
+        <w:t>B：R</w:t>
+      </w:r>
+      <w:r>
+        <w:rPr>
+          <w:rFonts w:ascii="Helvetica Neue" w:hAnsi="Helvetica Neue" w:eastAsia="PingFang TC"/>
+          <w:vertAlign w:val="subscript"/>
+        </w:rPr>
+        <w:t>0</w:t>
+      </w:r>
+      <w:r>
+        <w:rPr>
+          <w:rFonts w:ascii="Helvetica Neue" w:hAnsi="Helvetica Neue" w:eastAsia="PingFang TC"/>
+        </w:rPr>
+        <w:t xml:space="preserve"> 越多復發越早（Spearman −0.70）；抗藥細胞中 oncogene 比例越高也越早（−0.51）。Muller 圖的猜測得到確認。</w:t>
+      </w:r>
+    </w:p>
+    <w:p>
+      <w:pPr>
+        <w:pStyle w:val="ListBullet"/>
+      </w:pPr>
+      <w:r>
+        <w:rPr>
+          <w:rFonts w:ascii="Helvetica Neue" w:hAnsi="Helvetica Neue" w:eastAsia="PingFang TC"/>
+        </w:rPr>
+        <w:t xml:space="preserve">C：期望成長率在 </w:t>
+      </w:r>
+      <w:r>
+        <w:rPr>
+          <w:rFonts w:ascii="Helvetica Neue" w:hAnsi="Helvetica Neue" w:eastAsia="PingFang TC"/>
+        </w:rPr>
+        <w:t>ρ* = 70%</w:t>
+      </w:r>
+      <w:r>
+        <w:rPr>
+          <w:rFonts w:ascii="Helvetica Neue" w:hAnsi="Helvetica Neue" w:eastAsia="PingFang TC"/>
+        </w:rPr>
+        <w:t xml:space="preserve"> 穿過零。抗藥比例低於它，腫瘤縮小；高於它，腫瘤長大。這就是谷底的位置；帶 oncogene 的狀態稍早，約在 65% 由負轉正。</w:t>
+      </w:r>
+    </w:p>
+    <w:p>
+      <w:pPr>
+        <w:keepNext/>
+        <w:spacing w:after="0"/>
+      </w:pPr>
+      <w:r>
+        <w:rPr>
+          <w:rFonts w:ascii="Helvetica Neue" w:hAnsi="Helvetica Neue" w:eastAsia="PingFang TC"/>
+          <w:b/>
+          <w:color w:val="A9661A"/>
+        </w:rPr>
+        <w:t>限制</w:t>
+      </w:r>
+    </w:p>
+    <w:p>
+      <w:r>
+        <w:rPr>
+          <w:rFonts w:ascii="Helvetica Neue" w:hAnsi="Helvetica Neue" w:eastAsia="PingFang TC"/>
+        </w:rPr>
+        <w:t>預測用的是治療開始那一代的完整基因型組成，這在真實病人身上量不到；它說明的是「復發時間在治療開始時大致已經決定」，隨機性主要來自更早的突變時機。</w:t>
+      </w:r>
+    </w:p>
+    <w:p>
+      <w:pPr>
+        <w:pStyle w:val="Heading2"/>
+      </w:pPr>
+      <w:r>
+        <w:rPr>
+          <w:rFonts w:ascii="Helvetica Neue" w:hAnsi="Helvetica Neue" w:eastAsia="PingFang TC"/>
+        </w:rPr>
+        <w:t>圖 10 參數敏感度：殺傷率 × 突變率</w:t>
+      </w:r>
+    </w:p>
+    <w:p>
+      <w:r>
+        <w:rPr>
+          <w:rFonts w:ascii="Menlo" w:hAnsi="Menlo" w:eastAsia="PingFang TC"/>
+          <w:color w:val="56666F"/>
+          <w:sz w:val="17"/>
+        </w:rPr>
+        <w:t>outputs/therapy_analysis/10_parameter_sensitivity.png</w:t>
+      </w:r>
+      <w:r>
+        <w:rPr>
+          <w:rFonts w:ascii="Helvetica Neue" w:hAnsi="Helvetica Neue" w:eastAsia="PingFang TC"/>
+          <w:color w:val="56666F"/>
+          <w:sz w:val="17"/>
+        </w:rPr>
+        <w:t xml:space="preserve">　｜　</w:t>
+      </w:r>
+      <w:r>
+        <w:rPr>
+          <w:rFonts w:ascii="Helvetica Neue" w:hAnsi="Helvetica Neue" w:eastAsia="PingFang TC"/>
+          <w:b/>
+          <w:color w:val="56666F"/>
+          <w:sz w:val="17"/>
+        </w:rPr>
+        <w:t>備用</w:t>
+      </w:r>
+      <w:r>
+        <w:rPr>
+          <w:rFonts w:ascii="Helvetica Neue" w:hAnsi="Helvetica Neue" w:eastAsia="PingFang TC"/>
+          <w:color w:val="56666F"/>
+          <w:sz w:val="17"/>
+        </w:rPr>
+        <w:t xml:space="preserve"> </w:t>
+      </w:r>
+    </w:p>
+    <w:p>
+      <w:r>
+        <w:drawing>
+          <wp:inline xmlns:a="http://schemas.openxmlformats.org/drawingml/2006/main" xmlns:pic="http://schemas.openxmlformats.org/drawingml/2006/picture">
+            <wp:extent cx="5943600" cy="2201608"/>
+            <wp:docPr id="11" name="Picture 11"/>
+            <wp:cNvGraphicFramePr>
+              <a:graphicFrameLocks noChangeAspect="1"/>
+            </wp:cNvGraphicFramePr>
+            <a:graphic>
+              <a:graphicData uri="http://schemas.openxmlformats.org/drawingml/2006/picture">
+                <pic:pic>
+                  <pic:nvPicPr>
+                    <pic:cNvPr id="0" name="therapy_analysis-10_parameter_sensitivity.jpg"/>
+                    <pic:cNvPicPr/>
+                  </pic:nvPicPr>
+                  <pic:blipFill>
+                    <a:blip r:embed="rId19"/>
+                    <a:stretch>
+                      <a:fillRect/>
+                    </a:stretch>
+                  </pic:blipFill>
+                  <pic:spPr>
+                    <a:xfrm>
+                      <a:off x="0" y="0"/>
+                      <a:ext cx="5943600" cy="2201608"/>
+                    </a:xfrm>
+                    <a:prstGeom prst="rect"/>
+                  </pic:spPr>
+                </pic:pic>
+              </a:graphicData>
+            </a:graphic>
+          </wp:inline>
+        </w:drawing>
+      </w:r>
+    </w:p>
+    <w:p>
+      <w:pPr>
+        <w:keepNext/>
+        <w:spacing w:after="0"/>
+      </w:pPr>
+      <w:r>
+        <w:rPr>
+          <w:rFonts w:ascii="Helvetica Neue" w:hAnsi="Helvetica Neue" w:eastAsia="PingFang TC"/>
+          <w:b/>
+          <w:color w:val="1E6A86"/>
+        </w:rPr>
+        <w:t>為什麼做</w:t>
+      </w:r>
+    </w:p>
+    <w:p>
+      <w:r>
+        <w:rPr>
+          <w:rFonts w:ascii="Helvetica Neue" w:hAnsi="Helvetica Neue" w:eastAsia="PingFang TC"/>
+        </w:rPr>
+        <w:t>主結果「30/30 復發」只在預設參數成立嗎？這張同時改兩個最關鍵的參數：藥物對抗藥細胞的殺傷率 k</w:t>
+      </w:r>
+      <w:r>
+        <w:rPr>
+          <w:rFonts w:ascii="Helvetica Neue" w:hAnsi="Helvetica Neue" w:eastAsia="PingFang TC"/>
+          <w:vertAlign w:val="subscript"/>
+        </w:rPr>
+        <w:t>R</w:t>
+      </w:r>
+      <w:r>
+        <w:rPr>
+          <w:rFonts w:ascii="Helvetica Neue" w:hAnsi="Helvetica Neue" w:eastAsia="PingFang TC"/>
+        </w:rPr>
+        <w:t>（預設 0.04）和突變率 μ（預設 0.001），每格 30 次試驗。</w:t>
+      </w:r>
+    </w:p>
+    <w:p>
+      <w:pPr>
+        <w:keepNext/>
+        <w:spacing w:after="0"/>
+      </w:pPr>
+      <w:r>
+        <w:rPr>
+          <w:rFonts w:ascii="Helvetica Neue" w:hAnsi="Helvetica Neue" w:eastAsia="PingFang TC"/>
+          <w:b/>
+          <w:color w:val="1E6A86"/>
+        </w:rPr>
+        <w:t>怎麼讀</w:t>
+      </w:r>
+    </w:p>
+    <w:p>
+      <w:r>
+        <w:rPr>
+          <w:rFonts w:ascii="Helvetica Neue" w:hAnsi="Helvetica Neue" w:eastAsia="PingFang TC"/>
+        </w:rPr>
+        <w:t>A 是治癒機率，B 是復發試驗的復發延遲中位數（— 表示沒有試驗復發）。三條直線是理論邊界：某種抗藥細胞在治療下平均子代剛好為 1 的殺傷率，(1 − k</w:t>
+      </w:r>
+      <w:r>
+        <w:rPr>
+          <w:rFonts w:ascii="Helvetica Neue" w:hAnsi="Helvetica Neue" w:eastAsia="PingFang TC"/>
+          <w:vertAlign w:val="subscript"/>
+        </w:rPr>
+        <w:t>R</w:t>
+      </w:r>
+      <w:r>
+        <w:rPr>
+          <w:rFonts w:ascii="Helvetica Neue" w:hAnsi="Helvetica Neue" w:eastAsia="PingFang TC"/>
+        </w:rPr>
+        <w:t>)·m = 1。「pers.」是 250 代後仍存活、既沒治癒也沒復發的比例。</w:t>
+      </w:r>
+    </w:p>
+    <w:p>
+      <w:pPr>
+        <w:keepNext/>
+        <w:spacing w:after="0"/>
+      </w:pPr>
+      <w:r>
+        <w:rPr>
+          <w:rFonts w:ascii="Helvetica Neue" w:hAnsi="Helvetica Neue" w:eastAsia="PingFang TC"/>
+          <w:b/>
+          <w:color w:val="1E6A86"/>
+        </w:rPr>
+        <w:t>看到什麼</w:t>
+      </w:r>
+    </w:p>
+    <w:p/>
+    <w:p>
+      <w:pPr>
+        <w:pStyle w:val="ListBullet"/>
+      </w:pPr>
+      <w:r>
+        <w:rPr>
+          <w:rFonts w:ascii="Helvetica Neue" w:hAnsi="Helvetica Neue" w:eastAsia="PingFang TC"/>
+        </w:rPr>
+        <w:t>k</w:t>
+      </w:r>
+      <w:r>
+        <w:rPr>
+          <w:rFonts w:ascii="Helvetica Neue" w:hAnsi="Helvetica Neue" w:eastAsia="PingFang TC"/>
+          <w:vertAlign w:val="subscript"/>
+        </w:rPr>
+        <w:t>R</w:t>
+      </w:r>
+      <w:r>
+        <w:rPr>
+          <w:rFonts w:ascii="Helvetica Neue" w:hAnsi="Helvetica Neue" w:eastAsia="PingFang TC"/>
+        </w:rPr>
+        <w:t xml:space="preserve"> 低於 0.30 時，單純抗藥細胞在治療下仍會長，幾乎不可能治癒。</w:t>
+      </w:r>
+    </w:p>
+    <w:p>
+      <w:pPr>
+        <w:pStyle w:val="ListBullet"/>
+      </w:pPr>
+      <w:r>
+        <w:rPr>
+          <w:rFonts w:ascii="Helvetica Neue" w:hAnsi="Helvetica Neue" w:eastAsia="PingFang TC"/>
+          <w:b/>
+        </w:rPr>
+        <w:t>治癒邊界不在 0.30，而在約 0.41</w:t>
+      </w:r>
+      <w:r>
+        <w:rPr>
+          <w:rFonts w:ascii="Helvetica Neue" w:hAnsi="Helvetica Neue" w:eastAsia="PingFang TC"/>
+        </w:rPr>
+        <w:t>：只要治療開始時有「oncogene＋抗藥」的雙突變細胞，它們要到 k</w:t>
+      </w:r>
+      <w:r>
+        <w:rPr>
+          <w:rFonts w:ascii="Helvetica Neue" w:hAnsi="Helvetica Neue" w:eastAsia="PingFang TC"/>
+          <w:vertAlign w:val="subscript"/>
+        </w:rPr>
+        <w:t>R</w:t>
+      </w:r>
+      <w:r>
+        <w:rPr>
+          <w:rFonts w:ascii="Helvetica Neue" w:hAnsi="Helvetica Neue" w:eastAsia="PingFang TC"/>
+        </w:rPr>
+        <w:t xml:space="preserve"> = 0.41 才停止成長。突變率越高，這種細胞越可能已經存在，邊界越往右移（μ = 0.003 時 0.45 也只有 43% 治癒）。</w:t>
+      </w:r>
+    </w:p>
+    <w:p>
+      <w:pPr>
+        <w:pStyle w:val="ListBullet"/>
+      </w:pPr>
+      <w:r>
+        <w:rPr>
+          <w:rFonts w:ascii="Helvetica Neue" w:hAnsi="Helvetica Neue" w:eastAsia="PingFang TC"/>
+        </w:rPr>
+        <w:t>B：越接近邊界，復發越慢（最長中位 195 代）。殺傷率提高可以延後復發，但不一定能治癒。</w:t>
+      </w:r>
+    </w:p>
+    <w:p>
+      <w:pPr>
+        <w:keepNext/>
+        <w:spacing w:after="0"/>
+      </w:pPr>
+      <w:r>
+        <w:rPr>
+          <w:rFonts w:ascii="Helvetica Neue" w:hAnsi="Helvetica Neue" w:eastAsia="PingFang TC"/>
+          <w:b/>
+          <w:color w:val="A9661A"/>
+        </w:rPr>
+        <w:t>限制</w:t>
+      </w:r>
+    </w:p>
+    <w:p>
+      <w:r>
+        <w:rPr>
+          <w:rFonts w:ascii="Helvetica Neue" w:hAnsi="Helvetica Neue" w:eastAsia="PingFang TC"/>
+        </w:rPr>
+        <w:t>只改兩個參數，其他維持預設。0.25–0.45 的格子有少數持續存活的試驗，代表那裡的動態接近臨界，需要更長的觀察。</w:t>
+      </w:r>
+    </w:p>
+    <w:p>
+      <w:pPr>
+        <w:pStyle w:val="Heading2"/>
+      </w:pPr>
+      <w:r>
+        <w:rPr>
+          <w:rFonts w:ascii="Helvetica Neue" w:hAnsi="Helvetica Neue" w:eastAsia="PingFang TC"/>
+        </w:rPr>
+        <w:t>圖 11 適應性治療：只有在細胞互相競爭時才有用</w:t>
+      </w:r>
+    </w:p>
+    <w:p>
+      <w:r>
+        <w:rPr>
+          <w:rFonts w:ascii="Menlo" w:hAnsi="Menlo" w:eastAsia="PingFang TC"/>
+          <w:color w:val="56666F"/>
+          <w:sz w:val="17"/>
+        </w:rPr>
+        <w:t>outputs/therapy_analysis/11_adaptive_therapy.png</w:t>
+      </w:r>
+      <w:r>
+        <w:rPr>
+          <w:rFonts w:ascii="Helvetica Neue" w:hAnsi="Helvetica Neue" w:eastAsia="PingFang TC"/>
+          <w:color w:val="56666F"/>
+          <w:sz w:val="17"/>
+        </w:rPr>
+        <w:t xml:space="preserve">　｜　</w:t>
+      </w:r>
+      <w:r>
+        <w:rPr>
+          <w:rFonts w:ascii="Helvetica Neue" w:hAnsi="Helvetica Neue" w:eastAsia="PingFang TC"/>
+          <w:b/>
+          <w:color w:val="56666F"/>
+          <w:sz w:val="17"/>
+        </w:rPr>
+        <w:t>備用</w:t>
+      </w:r>
+      <w:r>
+        <w:rPr>
+          <w:rFonts w:ascii="Helvetica Neue" w:hAnsi="Helvetica Neue" w:eastAsia="PingFang TC"/>
+          <w:color w:val="56666F"/>
+          <w:sz w:val="17"/>
+        </w:rPr>
+        <w:t xml:space="preserve"> </w:t>
+      </w:r>
+    </w:p>
+    <w:p>
+      <w:r>
+        <w:drawing>
+          <wp:inline xmlns:a="http://schemas.openxmlformats.org/drawingml/2006/main" xmlns:pic="http://schemas.openxmlformats.org/drawingml/2006/picture">
+            <wp:extent cx="5943600" cy="2273427"/>
+            <wp:docPr id="12" name="Picture 12"/>
+            <wp:cNvGraphicFramePr>
+              <a:graphicFrameLocks noChangeAspect="1"/>
+            </wp:cNvGraphicFramePr>
+            <a:graphic>
+              <a:graphicData uri="http://schemas.openxmlformats.org/drawingml/2006/picture">
+                <pic:pic>
+                  <pic:nvPicPr>
+                    <pic:cNvPr id="0" name="therapy_analysis-11_adaptive_therapy.jpg"/>
+                    <pic:cNvPicPr/>
+                  </pic:nvPicPr>
+                  <pic:blipFill>
+                    <a:blip r:embed="rId20"/>
+                    <a:stretch>
+                      <a:fillRect/>
+                    </a:stretch>
+                  </pic:blipFill>
+                  <pic:spPr>
+                    <a:xfrm>
+                      <a:off x="0" y="0"/>
+                      <a:ext cx="5943600" cy="2273427"/>
+                    </a:xfrm>
+                    <a:prstGeom prst="rect"/>
+                  </pic:spPr>
+                </pic:pic>
+              </a:graphicData>
+            </a:graphic>
+          </wp:inline>
+        </w:drawing>
+      </w:r>
+    </w:p>
+    <w:p>
+      <w:pPr>
+        <w:keepNext/>
+        <w:spacing w:after="0"/>
+      </w:pPr>
+      <w:r>
+        <w:rPr>
+          <w:rFonts w:ascii="Helvetica Neue" w:hAnsi="Helvetica Neue" w:eastAsia="PingFang TC"/>
+          <w:b/>
+          <w:color w:val="1E6A86"/>
+        </w:rPr>
+        <w:t>為什麼做</w:t>
+      </w:r>
+    </w:p>
+    <w:p>
+      <w:r>
+        <w:rPr>
+          <w:rFonts w:ascii="Helvetica Neue" w:hAnsi="Helvetica Neue" w:eastAsia="PingFang TC"/>
+        </w:rPr>
+        <w:t>Gatenby 的適應性治療（adaptive therapy）主張：不要把敏感細胞殺光，讓它們留下來和抗藥細胞競爭，可以延後惡化。這需要兩個主模型沒有的假設，所以加了兩個預設關閉的選項：承載量競爭（N 越接近 K，每個細胞死亡率越高）與抗藥代價（抗藥細胞自然死亡率 +0.05）。</w:t>
+      </w:r>
+    </w:p>
+    <w:p>
+      <w:pPr>
+        <w:keepNext/>
+        <w:spacing w:after="0"/>
+      </w:pPr>
+      <w:r>
+        <w:rPr>
+          <w:rFonts w:ascii="Helvetica Neue" w:hAnsi="Helvetica Neue" w:eastAsia="PingFang TC"/>
+          <w:b/>
+          <w:color w:val="1E6A86"/>
+        </w:rPr>
+        <w:t>怎麼讀</w:t>
+      </w:r>
+    </w:p>
+    <w:p/>
+    <w:p>
+      <w:pPr>
+        <w:pStyle w:val="ListBullet"/>
+      </w:pPr>
+      <w:r>
+        <w:rPr>
+          <w:rFonts w:ascii="Helvetica Neue" w:hAnsi="Helvetica Neue" w:eastAsia="PingFang TC"/>
+          <w:b/>
+        </w:rPr>
+        <w:t>A／B</w:t>
+      </w:r>
+      <w:r>
+        <w:rPr>
+          <w:rFonts w:ascii="Helvetica Neue" w:hAnsi="Helvetica Neue" w:eastAsia="PingFang TC"/>
+        </w:rPr>
+        <w:t>：同一個 seed 在「競爭＋代價」下的持續治療與適應性治療。淡橘色是用藥的世代。適應性治療在負荷降到一半時暫停，回到 20,000 時恢復。</w:t>
+      </w:r>
+    </w:p>
+    <w:p>
+      <w:pPr>
+        <w:pStyle w:val="ListBullet"/>
+      </w:pPr>
+      <w:r>
+        <w:rPr>
+          <w:rFonts w:ascii="Helvetica Neue" w:hAnsi="Helvetica Neue" w:eastAsia="PingFang TC"/>
+          <w:b/>
+        </w:rPr>
+        <w:t>C</w:t>
+      </w:r>
+      <w:r>
+        <w:rPr>
+          <w:rFonts w:ascii="Helvetica Neue" w:hAnsi="Helvetica Neue" w:eastAsia="PingFang TC"/>
+        </w:rPr>
+        <w:t>：四種設定、每種 30 對試驗（兩種策略用同一組 seed）的惡化時間，右側是中位數比值（適應性 ÷ 持續）。惡化 = 用藥中負荷仍 ≥ 24,000。</w:t>
+      </w:r>
+    </w:p>
+    <w:p>
+      <w:pPr>
+        <w:keepNext/>
+        <w:spacing w:after="0"/>
+      </w:pPr>
+      <w:r>
+        <w:rPr>
+          <w:rFonts w:ascii="Helvetica Neue" w:hAnsi="Helvetica Neue" w:eastAsia="PingFang TC"/>
+          <w:b/>
+          <w:color w:val="1E6A86"/>
+        </w:rPr>
+        <w:t>看到什麼</w:t>
+      </w:r>
+    </w:p>
+    <w:p/>
+    <w:p>
+      <w:pPr>
+        <w:pStyle w:val="ListBullet"/>
+      </w:pPr>
+      <w:r>
+        <w:rPr>
+          <w:rFonts w:ascii="Helvetica Neue" w:hAnsi="Helvetica Neue" w:eastAsia="PingFang TC"/>
+          <w:b/>
+        </w:rPr>
+        <w:t>沒有競爭時，適應性治療比較差</w:t>
+      </w:r>
+      <w:r>
+        <w:rPr>
+          <w:rFonts w:ascii="Helvetica Neue" w:hAnsi="Helvetica Neue" w:eastAsia="PingFang TC"/>
+        </w:rPr>
+        <w:t>（×0.85、×0.91）：敏感細胞完全不會妨礙抗藥細胞，暫停只是讓抗藥細胞少挨 4% 的殺傷。這也是目前主模型的情況。</w:t>
+      </w:r>
+    </w:p>
+    <w:p>
+      <w:pPr>
+        <w:pStyle w:val="ListBullet"/>
+      </w:pPr>
+      <w:r>
+        <w:rPr>
+          <w:rFonts w:ascii="Helvetica Neue" w:hAnsi="Helvetica Neue" w:eastAsia="PingFang TC"/>
+          <w:b/>
+        </w:rPr>
+        <w:t>有競爭時，適應性治療延後惡化</w:t>
+      </w:r>
+      <w:r>
+        <w:rPr>
+          <w:rFonts w:ascii="Helvetica Neue" w:hAnsi="Helvetica Neue" w:eastAsia="PingFang TC"/>
+        </w:rPr>
+        <w:t>：中位 14 → 16 代（×1.14），配對比較中 30/30 次都比較長；加上抗藥代價後 17.5 → 20 代，29/30 次較長。而且只用了約一半的藥量。</w:t>
+      </w:r>
+    </w:p>
+    <w:p>
+      <w:pPr>
+        <w:pStyle w:val="ListBullet"/>
+      </w:pPr>
+      <w:r>
+        <w:rPr>
+          <w:rFonts w:ascii="Helvetica Neue" w:hAnsi="Helvetica Neue" w:eastAsia="PingFang TC"/>
+        </w:rPr>
+        <w:t>效果不大，因為治療前已有約 1% 抗藥細胞，競爭只能拖慢、不能阻止它們。</w:t>
+      </w:r>
+    </w:p>
+    <w:p>
+      <w:pPr>
+        <w:keepNext/>
+        <w:spacing w:after="0"/>
+      </w:pPr>
+      <w:r>
+        <w:rPr>
+          <w:rFonts w:ascii="Helvetica Neue" w:hAnsi="Helvetica Neue" w:eastAsia="PingFang TC"/>
+          <w:b/>
+          <w:color w:val="A9661A"/>
+        </w:rPr>
+        <w:t>限制</w:t>
+      </w:r>
+    </w:p>
+    <w:p>
+      <w:r>
+        <w:rPr>
+          <w:rFonts w:ascii="Helvetica Neue" w:hAnsi="Helvetica Neue" w:eastAsia="PingFang TC"/>
+        </w:rPr>
+        <w:t>競爭的形式（死亡率隨 N/K 線性上升）、K = 30,000、代價 0.05、暫停門檻 50% 都是教學假設。惡化定義要求「用藥中」，因為離散世代下暫停期一代可以長 20–30%，恢復用藥前那一步的超標不能算治療失敗。</w:t>
+      </w:r>
+    </w:p>
+    <w:p>
+      <w:pPr>
+        <w:pStyle w:val="Heading1"/>
+      </w:pPr>
+      <w:r>
+        <w:rPr>
+          <w:rFonts w:ascii="Helvetica Neue" w:hAnsi="Helvetica Neue" w:eastAsia="PingFang TC"/>
+        </w:rPr>
+        <w:t>06 對照實驗：TSG 與死亡率</w:t>
+      </w:r>
+    </w:p>
+    <w:p>
+      <w:r>
+        <w:rPr>
+          <w:rFonts w:ascii="Helvetica Neue" w:hAnsi="Helvetica Neue" w:eastAsia="PingFang TC"/>
+        </w:rPr>
+        <w:t>這兩張回答作業建議的兩個情境。原則是「一次只改一件事」：除了被比較的規則外，所有參數、基因數和突變率都相同，而且都不加治療。</w:t>
+      </w:r>
+    </w:p>
+    <w:p>
+      <w:pPr>
+        <w:pStyle w:val="Heading2"/>
+      </w:pPr>
+      <w:r>
+        <w:rPr>
+          <w:rFonts w:ascii="Helvetica Neue" w:hAnsi="Helvetica Neue" w:eastAsia="PingFang TC"/>
+        </w:rPr>
+        <w:t>圖 03 One-hit vs two-hit（含對照組）</w:t>
+      </w:r>
+    </w:p>
+    <w:p>
+      <w:r>
+        <w:rPr>
+          <w:rFonts w:ascii="Menlo" w:hAnsi="Menlo" w:eastAsia="PingFang TC"/>
+          <w:color w:val="56666F"/>
+          <w:sz w:val="17"/>
+        </w:rPr>
+        <w:t>outputs/03_one_hit_vs_two_hit.png</w:t>
+      </w:r>
+      <w:r>
+        <w:rPr>
+          <w:rFonts w:ascii="Helvetica Neue" w:hAnsi="Helvetica Neue" w:eastAsia="PingFang TC"/>
+          <w:color w:val="56666F"/>
+          <w:sz w:val="17"/>
+        </w:rPr>
+        <w:t xml:space="preserve">　｜　</w:t>
+      </w:r>
+      <w:r>
+        <w:rPr>
+          <w:rFonts w:ascii="Helvetica Neue" w:hAnsi="Helvetica Neue" w:eastAsia="PingFang TC"/>
+          <w:b/>
+          <w:color w:val="56666F"/>
+          <w:sz w:val="17"/>
+        </w:rPr>
+        <w:t>主圖</w:t>
+      </w:r>
+      <w:r>
+        <w:rPr>
+          <w:rFonts w:ascii="Helvetica Neue" w:hAnsi="Helvetica Neue" w:eastAsia="PingFang TC"/>
+          <w:color w:val="56666F"/>
+          <w:sz w:val="17"/>
+        </w:rPr>
+        <w:t xml:space="preserve"> </w:t>
+      </w:r>
+    </w:p>
+    <w:p>
+      <w:r>
+        <w:drawing>
+          <wp:inline xmlns:a="http://schemas.openxmlformats.org/drawingml/2006/main" xmlns:pic="http://schemas.openxmlformats.org/drawingml/2006/picture">
             <wp:extent cx="5943600" cy="2053018"/>
-            <wp:docPr id="10" name="Picture 10"/>
+            <wp:docPr id="13" name="Picture 13"/>
             <wp:cNvGraphicFramePr>
               <a:graphicFrameLocks noChangeAspect="1"/>
             </wp:cNvGraphicFramePr>
@@ -3233,7 +4060,7 @@
                     <pic:cNvPicPr/>
                   </pic:nvPicPr>
                   <pic:blipFill>
-                    <a:blip r:embed="rId18"/>
+                    <a:blip r:embed="rId21"/>
                     <a:stretch>
                       <a:fillRect/>
                     </a:stretch>
@@ -3554,7 +4381,7 @@
         <w:drawing>
           <wp:inline xmlns:a="http://schemas.openxmlformats.org/drawingml/2006/main" xmlns:pic="http://schemas.openxmlformats.org/drawingml/2006/picture">
             <wp:extent cx="5943600" cy="2488882"/>
-            <wp:docPr id="11" name="Picture 11"/>
+            <wp:docPr id="14" name="Picture 14"/>
             <wp:cNvGraphicFramePr>
               <a:graphicFrameLocks noChangeAspect="1"/>
             </wp:cNvGraphicFramePr>
@@ -3566,7 +4393,7 @@
                     <pic:cNvPicPr/>
                   </pic:nvPicPr>
                   <pic:blipFill>
-                    <a:blip r:embed="rId19"/>
+                    <a:blip r:embed="rId22"/>
                     <a:stretch>
                       <a:fillRect/>
                     </a:stretch>
@@ -3742,7 +4569,7 @@
         <w:rPr>
           <w:rFonts w:ascii="Helvetica Neue" w:hAnsi="Helvetica Neue" w:eastAsia="PingFang TC"/>
         </w:rPr>
-        <w:t>26</w:t>
+        <w:t>26.5</w:t>
       </w:r>
       <w:r>
         <w:rPr>
@@ -3759,7 +4586,7 @@
         <w:rPr>
           <w:rFonts w:ascii="Helvetica Neue" w:hAnsi="Helvetica Neue" w:eastAsia="PingFang TC"/>
         </w:rPr>
-        <w:t>0.45 時實際 26 代，比只用無突變細胞估算的 ln 50 / ln 1.12 ≈ 34 代少，因為 oncogene 細胞長得比較快。</w:t>
+        <w:t>0.45 時實際 26.5 代（30 次試驗的中位數落在第 15、16 個值之間），比只用無突變細胞估算的 ln 50 / ln 1.12 ≈ 34 代少，因為 oncogene 細胞長得比較快。</w:t>
       </w:r>
     </w:p>
     <w:p>
@@ -3885,7 +4712,7 @@
         <w:drawing>
           <wp:inline xmlns:a="http://schemas.openxmlformats.org/drawingml/2006/main" xmlns:pic="http://schemas.openxmlformats.org/drawingml/2006/picture">
             <wp:extent cx="5943600" cy="2015871"/>
-            <wp:docPr id="12" name="Picture 12"/>
+            <wp:docPr id="15" name="Picture 15"/>
             <wp:cNvGraphicFramePr>
               <a:graphicFrameLocks noChangeAspect="1"/>
             </wp:cNvGraphicFramePr>
@@ -3897,7 +4724,7 @@
                     <pic:cNvPicPr/>
                   </pic:nvPicPr>
                   <pic:blipFill>
-                    <a:blip r:embed="rId20"/>
+                    <a:blip r:embed="rId23"/>
                     <a:stretch>
                       <a:fillRect/>
                     </a:stretch>
@@ -4173,7 +5000,7 @@
         <w:rPr>
           <w:rFonts w:ascii="Helvetica Neue" w:hAnsi="Helvetica Neue" w:eastAsia="PingFang TC"/>
         </w:rPr>
-        <w:t>判斷原則：一張圖如果 (1) 某些格子是其他格子的數學轉換、(2) 與另一張用同樣座標畫同樣資料、或 (3) 只有記帳資訊，就合併或移到註腳。唯一例外是 PCA：原本建議放備用，現在改成主圖，因為它能直接回答哪個因子主導走向。</w:t>
+        <w:t>判斷原則：一張圖如果 (1) 某些格子是其他格子的數學轉換、(2) 與另一張用同樣座標畫同樣資料、或 (3) 只有記帳資訊，就合併或移到註腳。PCA 原本建議放備用，最後整張刪除：它最大的主成分只是「時間／大小」，與模擬的生物問題關係較遠。它唯一有用的結論（ρ* ≈ 70% 是谷底）移到圖 09C。</w:t>
       </w:r>
     </w:p>
     <w:tbl>
@@ -4321,7 +5148,7 @@
                 <w:rFonts w:ascii="Helvetica Neue" w:hAnsi="Helvetica Neue" w:eastAsia="PingFang TC"/>
                 <w:sz w:val="19"/>
               </w:rPr>
-              <w:t>獨立成「死亡率 vs 異質性」，加上達到 5,000 所需代數（實際 8 / 14 / 26 代）。</w:t>
+              <w:t>獨立成「死亡率 vs 異質性」，加上達到 5,000 所需代數（實際 8 / 14 / 26.5 代）。</w:t>
             </w:r>
           </w:p>
         </w:tc>
@@ -4541,7 +5368,7 @@
                 <w:rFonts w:ascii="Helvetica Neue" w:hAnsi="Helvetica Neue" w:eastAsia="PingFang TC"/>
                 <w:sz w:val="19"/>
               </w:rPr>
-              <w:t>「突變供應」的觀點寫進 07 與 PCA 的文字。</w:t>
+              <w:t>「突變供應」的觀點寫進 07 與 08B 的文字。</w:t>
             </w:r>
           </w:p>
         </w:tc>
@@ -4615,7 +5442,7 @@
                 <w:rFonts w:ascii="Helvetica Neue" w:hAnsi="Helvetica Neue" w:eastAsia="PingFang TC"/>
                 <w:sz w:val="19"/>
               </w:rPr>
-              <w:t>PCA（主圖）</w:t>
+              <w:t>刪除</w:t>
             </w:r>
           </w:p>
         </w:tc>
@@ -4629,7 +5456,51 @@
                 <w:rFonts w:ascii="Helvetica Neue" w:hAnsi="Helvetica Neue" w:eastAsia="PingFang TC"/>
                 <w:sz w:val="19"/>
               </w:rPr>
-              <w:t>只用生物因子做 PCA，加上漂移／噪音分解、因子組解釋力與兩條機制曲線。</w:t>
+              <w:t>與模擬的生物問題關係較遠；ρ* 曲線移到 09C。</w:t>
+            </w:r>
+          </w:p>
+        </w:tc>
+      </w:tr>
+      <w:tr>
+        <w:tc>
+          <w:tcPr>
+            <w:tcW w:type="dxa" w:w="1800"/>
+          </w:tcPr>
+          <w:p>
+            <w:r>
+              <w:rPr>
+                <w:rFonts w:ascii="Helvetica Neue" w:hAnsi="Helvetica Neue" w:eastAsia="PingFang TC"/>
+                <w:sz w:val="19"/>
+              </w:rPr>
+              <w:t>（新）</w:t>
+            </w:r>
+          </w:p>
+        </w:tc>
+        <w:tc>
+          <w:tcPr>
+            <w:tcW w:type="dxa" w:w="2088"/>
+          </w:tcPr>
+          <w:p>
+            <w:r>
+              <w:rPr>
+                <w:rFonts w:ascii="Helvetica Neue" w:hAnsi="Helvetica Neue" w:eastAsia="PingFang TC"/>
+                <w:sz w:val="19"/>
+              </w:rPr>
+              <w:t>08–11</w:t>
+            </w:r>
+          </w:p>
+        </w:tc>
+        <w:tc>
+          <w:tcPr>
+            <w:tcW w:type="dxa" w:w="5472"/>
+          </w:tcPr>
+          <w:p>
+            <w:r>
+              <w:rPr>
+                <w:rFonts w:ascii="Helvetica Neue" w:hAnsi="Helvetica Neue" w:eastAsia="PingFang TC"/>
+                <w:sz w:val="19"/>
+              </w:rPr>
+              <w:t>Goldie–Coldman 治療時機、復發時間預測、參數敏感度、適應性治療。</w:t>
             </w:r>
           </w:p>
         </w:tc>
@@ -4780,13 +5651,13 @@
           <w:rFonts w:ascii="Helvetica Neue" w:hAnsi="Helvetica Neue" w:eastAsia="PingFang TC"/>
           <w:b/>
         </w:rPr>
-        <w:t>PCA 與漂移分解</w:t>
-      </w:r>
-      <w:r>
-        <w:rPr>
-          <w:rFonts w:ascii="Helvetica Neue" w:hAnsi="Helvetica Neue" w:eastAsia="PingFang TC"/>
-        </w:rPr>
-        <w:t>：V 字的轉折點就是 ρ = 70%；變異最大的是時間，決定走向的是適應度。</w:t>
+        <w:t>治療時機（08）</w:t>
+      </w:r>
+      <w:r>
+        <w:rPr>
+          <w:rFonts w:ascii="Helvetica Neue" w:hAnsi="Helvetica Neue" w:eastAsia="PingFang TC"/>
+        </w:rPr>
+        <w:t>：約 400 個細胞前治療，治癒機率才過半；理論與模擬吻合。</w:t>
       </w:r>
     </w:p>
     <w:p>
@@ -4798,13 +5669,13 @@
           <w:rFonts w:ascii="Helvetica Neue" w:hAnsi="Helvetica Neue" w:eastAsia="PingFang TC"/>
           <w:b/>
         </w:rPr>
-        <w:t>TSG 對照（03）＋ 死亡率（02）</w:t>
-      </w:r>
-      <w:r>
-        <w:rPr>
-          <w:rFonts w:ascii="Helvetica Neue" w:hAnsi="Helvetica Neue" w:eastAsia="PingFang TC"/>
-        </w:rPr>
-        <w:t>：two-hit ≈ 對照；高周轉更異質。</w:t>
+        <w:t>復發時間預測（09）</w:t>
+      </w:r>
+      <w:r>
+        <w:rPr>
+          <w:rFonts w:ascii="Helvetica Neue" w:hAnsi="Helvetica Neue" w:eastAsia="PingFang TC"/>
+        </w:rPr>
+        <w:t>：知道治療開始時有哪些抗藥細胞，就能預測復發在哪一代（30 次中 24 次完全命中）。</w:t>
       </w:r>
     </w:p>
     <w:p>
@@ -4816,21 +5687,39 @@
           <w:rFonts w:ascii="Helvetica Neue" w:hAnsi="Helvetica Neue" w:eastAsia="PingFang TC"/>
           <w:b/>
         </w:rPr>
-        <w:t>IL11（04）</w:t>
-      </w:r>
-      <w:r>
-        <w:rPr>
-          <w:rFonts w:ascii="Helvetica Neue" w:hAnsi="Helvetica Neue" w:eastAsia="PingFang TC"/>
-        </w:rPr>
-        <w:t>（時間允許）：1.6% 生產者讓腫瘤多長 52%。</w:t>
+        <w:t>TSG 對照（03）＋ 死亡率（02）</w:t>
+      </w:r>
+      <w:r>
+        <w:rPr>
+          <w:rFonts w:ascii="Helvetica Neue" w:hAnsi="Helvetica Neue" w:eastAsia="PingFang TC"/>
+        </w:rPr>
+        <w:t>：two-hit ≈ 對照；高周轉更異質。</w:t>
       </w:r>
     </w:p>
     <w:p>
-      <w:r>
-        <w:rPr>
-          <w:rFonts w:ascii="Helvetica Neue" w:hAnsi="Helvetica Neue" w:eastAsia="PingFang TC"/>
-        </w:rPr>
-        <w:t>備用：基因頻率軌跡、相圖 01、圖 07、相圖 06、附錄 A1。</w:t>
+      <w:pPr>
+        <w:pStyle w:val="ListNumber"/>
+      </w:pPr>
+      <w:r>
+        <w:rPr>
+          <w:rFonts w:ascii="Helvetica Neue" w:hAnsi="Helvetica Neue" w:eastAsia="PingFang TC"/>
+          <w:b/>
+        </w:rPr>
+        <w:t>IL11（04）</w:t>
+      </w:r>
+      <w:r>
+        <w:rPr>
+          <w:rFonts w:ascii="Helvetica Neue" w:hAnsi="Helvetica Neue" w:eastAsia="PingFang TC"/>
+        </w:rPr>
+        <w:t>（時間允許）：1.6% 生產者讓腫瘤多長 52%。</w:t>
+      </w:r>
+    </w:p>
+    <w:p>
+      <w:r>
+        <w:rPr>
+          <w:rFonts w:ascii="Helvetica Neue" w:hAnsi="Helvetica Neue" w:eastAsia="PingFang TC"/>
+        </w:rPr>
+        <w:t>備用：基因頻率軌跡、相圖 01、圖 07、相圖 06、參數敏感度（10）、適應性治療（11）、附錄 A1。</w:t>
       </w:r>
     </w:p>
     <w:p>
@@ -4895,7 +5784,7 @@
         <w:drawing>
           <wp:inline xmlns:a="http://schemas.openxmlformats.org/drawingml/2006/main" xmlns:pic="http://schemas.openxmlformats.org/drawingml/2006/picture">
             <wp:extent cx="5943600" cy="5557266"/>
-            <wp:docPr id="13" name="Picture 13"/>
+            <wp:docPr id="16" name="Picture 16"/>
             <wp:cNvGraphicFramePr>
               <a:graphicFrameLocks noChangeAspect="1"/>
             </wp:cNvGraphicFramePr>
@@ -4907,7 +5796,7 @@
                     <pic:cNvPicPr/>
                   </pic:nvPicPr>
                   <pic:blipFill>
-                    <a:blip r:embed="rId21"/>
+                    <a:blip r:embed="rId24"/>
                     <a:stretch>
                       <a:fillRect/>
                     </a:stretch>
@@ -5035,13 +5924,43 @@
           <w:rFonts w:ascii="Helvetica Neue" w:hAnsi="Helvetica Neue" w:eastAsia="PingFang TC"/>
           <w:b/>
         </w:rPr>
-        <w:t>PCA</w:t>
-      </w:r>
-      <w:r>
-        <w:rPr>
-          <w:rFonts w:ascii="Helvetica Neue" w:hAnsi="Helvetica Neue" w:eastAsia="PingFang TC"/>
-        </w:rPr>
-        <w:t>找出一群狀態量「一起變化最多」的方向。變異大不等於會決定下一步。</w:t>
+        <w:t>Goldie–Coldman</w:t>
+      </w:r>
+      <w:r>
+        <w:rPr>
+          <w:rFonts w:ascii="Helvetica Neue" w:hAnsi="Helvetica Neue" w:eastAsia="PingFang TC"/>
+        </w:rPr>
+        <w:t>抗藥突變隨腫瘤長大而累積，所以越早治療，越可能還沒有抗藥細胞，越可能治癒。</w:t>
+      </w:r>
+    </w:p>
+    <w:p>
+      <w:r>
+        <w:rPr>
+          <w:rFonts w:ascii="Helvetica Neue" w:hAnsi="Helvetica Neue" w:eastAsia="PingFang TC"/>
+          <w:b/>
+        </w:rPr>
+        <w:t>Wilson 區間</w:t>
+      </w:r>
+      <w:r>
+        <w:rPr>
+          <w:rFonts w:ascii="Helvetica Neue" w:hAnsi="Helvetica Neue" w:eastAsia="PingFang TC"/>
+        </w:rPr>
+        <w:t>比例（例如治癒率）的 95% 信賴區間；在接近 0% 或 100% 時比常態近似可靠。</w:t>
+      </w:r>
+    </w:p>
+    <w:p>
+      <w:r>
+        <w:rPr>
+          <w:rFonts w:ascii="Helvetica Neue" w:hAnsi="Helvetica Neue" w:eastAsia="PingFang TC"/>
+          <w:b/>
+        </w:rPr>
+        <w:t>惡化時間（TTP）</w:t>
+      </w:r>
+      <w:r>
+        <w:rPr>
+          <w:rFonts w:ascii="Helvetica Neue" w:hAnsi="Helvetica Neue" w:eastAsia="PingFang TC"/>
+        </w:rPr>
+        <w:t>從開始治療到「用藥中負荷仍超過門檻 1.2 倍」的代數，比較治療策略時使用。</w:t>
       </w:r>
     </w:p>
     <w:p>

</xml_diff>

<commit_message>
Overlay simulated trajectories on the figure 07 vector fields
</commit_message>
<xml_diff>
--- a/outputs/腫瘤分枝模型圖解.docx
+++ b/outputs/腫瘤分枝模型圖解.docx
@@ -799,7 +799,7 @@
       <w:r>
         <w:drawing>
           <wp:inline xmlns:a="http://schemas.openxmlformats.org/drawingml/2006/main" xmlns:pic="http://schemas.openxmlformats.org/drawingml/2006/picture">
-            <wp:extent cx="5943600" cy="3551301"/>
+            <wp:extent cx="5943600" cy="2954464"/>
             <wp:docPr id="2" name="Picture 2"/>
             <wp:cNvGraphicFramePr>
               <a:graphicFrameLocks noChangeAspect="1"/>
@@ -820,7 +820,7 @@
                   <pic:spPr>
                     <a:xfrm>
                       <a:off x="0" y="0"/>
-                      <a:ext cx="5943600" cy="3551301"/>
+                      <a:ext cx="5943600" cy="2954464"/>
                     </a:xfrm>
                     <a:prstGeom prst="rect"/>
                   </pic:spPr>
@@ -932,6 +932,24 @@
     </w:p>
     <w:p>
       <w:pPr>
+        <w:pStyle w:val="ListBullet"/>
+      </w:pPr>
+      <w:r>
+        <w:rPr>
+          <w:rFonts w:ascii="Helvetica Neue" w:hAnsi="Helvetica Neue" w:eastAsia="PingFang TC"/>
+          <w:b/>
+        </w:rPr>
+        <w:t>實際路徑</w:t>
+      </w:r>
+      <w:r>
+        <w:rPr>
+          <w:rFonts w:ascii="Helvetica Neue" w:hAnsi="Helvetica Neue" w:eastAsia="PingFang TC"/>
+        </w:rPr>
+        <w:t>：灰線是主實驗 30 次試驗（完整模型，含 oncogene），橘線是代表試驗 rep 4，每個點一代，菱形是開始治療。B 只畫治療前那段，C 畫治療開始之後那段，讓每段路徑落在自己那組箭頭上。</w:t>
+      </w:r>
+    </w:p>
+    <w:p>
+      <w:pPr>
         <w:keepNext/>
         <w:spacing w:after="0"/>
       </w:pPr>
@@ -983,6 +1001,24 @@
     </w:p>
     <w:p>
       <w:pPr>
+        <w:pStyle w:val="ListBullet"/>
+      </w:pPr>
+      <w:r>
+        <w:rPr>
+          <w:rFonts w:ascii="Helvetica Neue" w:hAnsi="Helvetica Neue" w:eastAsia="PingFang TC"/>
+          <w:b/>
+        </w:rPr>
+        <w:t>實際路徑順著箭頭走</w:t>
+      </w:r>
+      <w:r>
+        <w:rPr>
+          <w:rFonts w:ascii="Helvetica Neue" w:hAnsi="Helvetica Neue" w:eastAsia="PingFang TC"/>
+        </w:rPr>
+        <w:t>：治療前沿著底邊往右（抗藥細胞只有幾百個，幾乎貼著 S 軸）；治療後往左衝到 S = 0，再沿 R 軸往上，超出畫面。雖然箭頭只用基準細胞算，含 oncogene 的真實試驗仍完全照著這個流向。</w:t>
+      </w:r>
+    </w:p>
+    <w:p>
+      <w:pPr>
         <w:keepNext/>
         <w:spacing w:after="0"/>
       </w:pPr>
@@ -1000,7 +1036,7 @@
         <w:rPr>
           <w:rFonts w:ascii="Helvetica Neue" w:hAnsi="Helvetica Neue" w:eastAsia="PingFang TC"/>
         </w:rPr>
-        <w:t>線性座標只看得到幾千到幾萬個細胞，小族群擠在原點附近。對數座標的版本（舊相圖 04）已刪除：它唯一的新資訊是「大族群會持續供應抗藥突變」，這點在相圖 05 上排與圖 08B 都看得到。截面假設沒有 oncogene 細胞。</w:t>
+        <w:t>線性座標只看得到幾千到幾萬個細胞，小族群擠在原點附近，所以實際路徑看起來貼著兩條軸；同一批路徑的 log 座標版本是相圖 01。對數座標的版本（舊相圖 04）已刪除：它唯一的新資訊是「大族群會持續供應抗藥突變」，這點在相圖 05 上排與圖 08B 都看得到。截面假設沒有 oncogene 細胞。</w:t>
       </w:r>
     </w:p>
     <w:p>

</xml_diff>